<commit_message>
Adding DFS Graph Algorithm
</commit_message>
<xml_diff>
--- a/Graph Algorithm/Graph.docx
+++ b/Graph Algorithm/Graph.docx
@@ -1873,6 +1873,1455 @@
       </w:pPr>
       <w:r>
         <w:t>In the worst-case scenario (like a star-shaped graph where one central node is connected to all others), the queue and the visited set will hold all vertices at once.</w:t>
+      </w:r>
+    </w:p>
+    <w:p>
+      <w:pPr>
+        <w:jc w:val="center"/>
+        <w:rPr>
+          <w:b/>
+          <w:sz w:val="36"/>
+          <w:szCs w:val="36"/>
+        </w:rPr>
+      </w:pPr>
+    </w:p>
+    <w:p>
+      <w:pPr>
+        <w:jc w:val="center"/>
+        <w:rPr>
+          <w:b/>
+          <w:sz w:val="36"/>
+          <w:szCs w:val="36"/>
+        </w:rPr>
+      </w:pPr>
+    </w:p>
+    <w:p>
+      <w:pPr>
+        <w:jc w:val="center"/>
+        <w:rPr>
+          <w:b/>
+          <w:sz w:val="36"/>
+          <w:szCs w:val="36"/>
+        </w:rPr>
+      </w:pPr>
+      <w:r>
+        <w:rPr>
+          <w:b/>
+          <w:sz w:val="36"/>
+          <w:szCs w:val="36"/>
+        </w:rPr>
+        <w:t>Depth-First Search (DFS)</w:t>
+      </w:r>
+    </w:p>
+    <w:p>
+      <w:pPr>
+        <w:spacing w:before="100" w:beforeAutospacing="1" w:after="100" w:afterAutospacing="1" w:line="240" w:lineRule="auto"/>
+        <w:rPr>
+          <w:rFonts w:ascii="Times New Roman" w:eastAsia="Times New Roman" w:hAnsi="Times New Roman" w:cs="Times New Roman"/>
+          <w:sz w:val="24"/>
+          <w:szCs w:val="24"/>
+        </w:rPr>
+      </w:pPr>
+      <w:r>
+        <w:rPr>
+          <w:rFonts w:ascii="Times New Roman" w:eastAsia="Times New Roman" w:hAnsi="Times New Roman" w:cs="Times New Roman"/>
+          <w:sz w:val="24"/>
+          <w:szCs w:val="24"/>
+        </w:rPr>
+        <w:t xml:space="preserve">Depth-First Search (DFS) is the other pillar of graph traversal. While BFS explores a graph layer-by-layer (like ripples in a pond), DFS explores </w:t>
+      </w:r>
+      <w:r>
+        <w:rPr>
+          <w:rFonts w:ascii="Times New Roman" w:eastAsia="Times New Roman" w:hAnsi="Times New Roman" w:cs="Times New Roman"/>
+          <w:b/>
+          <w:bCs/>
+          <w:sz w:val="24"/>
+          <w:szCs w:val="24"/>
+        </w:rPr>
+        <w:t>as deeply as possible</w:t>
+      </w:r>
+      <w:r>
+        <w:rPr>
+          <w:rFonts w:ascii="Times New Roman" w:eastAsia="Times New Roman" w:hAnsi="Times New Roman" w:cs="Times New Roman"/>
+          <w:sz w:val="24"/>
+          <w:szCs w:val="24"/>
+        </w:rPr>
+        <w:t xml:space="preserve"> along each branch before backtracking.</w:t>
+      </w:r>
+    </w:p>
+    <w:p>
+      <w:pPr>
+        <w:spacing w:before="100" w:beforeAutospacing="1" w:after="100" w:afterAutospacing="1" w:line="240" w:lineRule="auto"/>
+        <w:rPr>
+          <w:rFonts w:ascii="Times New Roman" w:eastAsia="Times New Roman" w:hAnsi="Times New Roman" w:cs="Times New Roman"/>
+          <w:sz w:val="24"/>
+          <w:szCs w:val="24"/>
+        </w:rPr>
+      </w:pPr>
+      <w:r>
+        <w:rPr>
+          <w:rFonts w:ascii="Times New Roman" w:eastAsia="Times New Roman" w:hAnsi="Times New Roman" w:cs="Times New Roman"/>
+          <w:sz w:val="24"/>
+          <w:szCs w:val="24"/>
+        </w:rPr>
+        <w:t>Think of DFS like exploring a maze: you pick a path and keep walking until you hit a dead end. When you hit that dead end, you back up to the last junction and try the next path.</w:t>
+      </w:r>
+    </w:p>
+    <w:p>
+      <w:pPr>
+        <w:spacing w:before="100" w:beforeAutospacing="1" w:after="100" w:afterAutospacing="1" w:line="240" w:lineRule="auto"/>
+        <w:outlineLvl w:val="1"/>
+        <w:rPr>
+          <w:rFonts w:ascii="Times New Roman" w:eastAsia="Times New Roman" w:hAnsi="Times New Roman" w:cs="Times New Roman"/>
+          <w:b/>
+          <w:bCs/>
+          <w:sz w:val="36"/>
+          <w:szCs w:val="36"/>
+        </w:rPr>
+      </w:pPr>
+      <w:r>
+        <w:rPr>
+          <w:rFonts w:ascii="Times New Roman" w:eastAsia="Times New Roman" w:hAnsi="Times New Roman" w:cs="Times New Roman"/>
+          <w:b/>
+          <w:bCs/>
+          <w:sz w:val="36"/>
+          <w:szCs w:val="36"/>
+        </w:rPr>
+        <w:t>How DFS Works (The Core Logic)</w:t>
+      </w:r>
+    </w:p>
+    <w:p>
+      <w:pPr>
+        <w:spacing w:before="100" w:beforeAutospacing="1" w:after="100" w:afterAutospacing="1" w:line="240" w:lineRule="auto"/>
+        <w:rPr>
+          <w:rFonts w:ascii="Times New Roman" w:eastAsia="Times New Roman" w:hAnsi="Times New Roman" w:cs="Times New Roman"/>
+          <w:sz w:val="24"/>
+          <w:szCs w:val="24"/>
+        </w:rPr>
+      </w:pPr>
+      <w:r>
+        <w:rPr>
+          <w:rFonts w:ascii="Times New Roman" w:eastAsia="Times New Roman" w:hAnsi="Times New Roman" w:cs="Times New Roman"/>
+          <w:sz w:val="24"/>
+          <w:szCs w:val="24"/>
+        </w:rPr>
+        <w:lastRenderedPageBreak/>
+        <w:t>To track its progress and handle backtracking, DFS relies on a different mechanism than BFS:</w:t>
+      </w:r>
+    </w:p>
+    <w:p>
+      <w:pPr>
+        <w:numPr>
+          <w:ilvl w:val="0"/>
+          <w:numId w:val="5"/>
+        </w:numPr>
+        <w:spacing w:before="100" w:beforeAutospacing="1" w:after="100" w:afterAutospacing="1" w:line="240" w:lineRule="auto"/>
+        <w:rPr>
+          <w:rFonts w:ascii="Times New Roman" w:eastAsia="Times New Roman" w:hAnsi="Times New Roman" w:cs="Times New Roman"/>
+          <w:sz w:val="24"/>
+          <w:szCs w:val="24"/>
+        </w:rPr>
+      </w:pPr>
+      <w:r>
+        <w:rPr>
+          <w:rFonts w:ascii="Times New Roman" w:eastAsia="Times New Roman" w:hAnsi="Times New Roman" w:cs="Times New Roman"/>
+          <w:b/>
+          <w:bCs/>
+          <w:sz w:val="24"/>
+          <w:szCs w:val="24"/>
+        </w:rPr>
+        <w:t>A Stack (LIFO - Last In, First Out):</w:t>
+      </w:r>
+      <w:r>
+        <w:rPr>
+          <w:rFonts w:ascii="Times New Roman" w:eastAsia="Times New Roman" w:hAnsi="Times New Roman" w:cs="Times New Roman"/>
+          <w:sz w:val="24"/>
+          <w:szCs w:val="24"/>
+        </w:rPr>
+        <w:t xml:space="preserve"> This can be done explicitly using a Python list as a stack, or implicitly by using </w:t>
+      </w:r>
+      <w:r>
+        <w:rPr>
+          <w:rFonts w:ascii="Times New Roman" w:eastAsia="Times New Roman" w:hAnsi="Times New Roman" w:cs="Times New Roman"/>
+          <w:b/>
+          <w:bCs/>
+          <w:sz w:val="24"/>
+          <w:szCs w:val="24"/>
+        </w:rPr>
+        <w:t>recursion</w:t>
+      </w:r>
+      <w:r>
+        <w:rPr>
+          <w:rFonts w:ascii="Times New Roman" w:eastAsia="Times New Roman" w:hAnsi="Times New Roman" w:cs="Times New Roman"/>
+          <w:sz w:val="24"/>
+          <w:szCs w:val="24"/>
+        </w:rPr>
+        <w:t xml:space="preserve"> (which uses the system's call stack).</w:t>
+      </w:r>
+    </w:p>
+    <w:p>
+      <w:pPr>
+        <w:numPr>
+          <w:ilvl w:val="0"/>
+          <w:numId w:val="5"/>
+        </w:numPr>
+        <w:spacing w:before="100" w:beforeAutospacing="1" w:after="100" w:afterAutospacing="1" w:line="240" w:lineRule="auto"/>
+        <w:rPr>
+          <w:rFonts w:ascii="Times New Roman" w:eastAsia="Times New Roman" w:hAnsi="Times New Roman" w:cs="Times New Roman"/>
+          <w:sz w:val="24"/>
+          <w:szCs w:val="24"/>
+        </w:rPr>
+      </w:pPr>
+      <w:r>
+        <w:rPr>
+          <w:rFonts w:ascii="Times New Roman" w:eastAsia="Times New Roman" w:hAnsi="Times New Roman" w:cs="Times New Roman"/>
+          <w:b/>
+          <w:bCs/>
+          <w:sz w:val="24"/>
+          <w:szCs w:val="24"/>
+        </w:rPr>
+        <w:t>A Visited Set:</w:t>
+      </w:r>
+      <w:r>
+        <w:rPr>
+          <w:rFonts w:ascii="Times New Roman" w:eastAsia="Times New Roman" w:hAnsi="Times New Roman" w:cs="Times New Roman"/>
+          <w:sz w:val="24"/>
+          <w:szCs w:val="24"/>
+        </w:rPr>
+        <w:t xml:space="preserve"> Just like BFS, we need to remember where we've been to avoid getting trapped in infinite loops.</w:t>
+      </w:r>
+    </w:p>
+    <w:p>
+      <w:pPr>
+        <w:spacing w:before="100" w:beforeAutospacing="1" w:after="100" w:afterAutospacing="1" w:line="240" w:lineRule="auto"/>
+        <w:outlineLvl w:val="1"/>
+        <w:rPr>
+          <w:rFonts w:ascii="Times New Roman" w:eastAsia="Times New Roman" w:hAnsi="Times New Roman" w:cs="Times New Roman"/>
+          <w:b/>
+          <w:bCs/>
+          <w:sz w:val="36"/>
+          <w:szCs w:val="36"/>
+        </w:rPr>
+      </w:pPr>
+      <w:r>
+        <w:rPr>
+          <w:rFonts w:ascii="Times New Roman" w:eastAsia="Times New Roman" w:hAnsi="Times New Roman" w:cs="Times New Roman"/>
+          <w:b/>
+          <w:bCs/>
+          <w:sz w:val="36"/>
+          <w:szCs w:val="36"/>
+        </w:rPr>
+        <w:t>Steps of Execution: A Walkthrough</w:t>
+      </w:r>
+    </w:p>
+    <w:p>
+      <w:pPr>
+        <w:spacing w:before="100" w:beforeAutospacing="1" w:after="100" w:afterAutospacing="1" w:line="240" w:lineRule="auto"/>
+        <w:rPr>
+          <w:rFonts w:ascii="Times New Roman" w:eastAsia="Times New Roman" w:hAnsi="Times New Roman" w:cs="Times New Roman"/>
+          <w:sz w:val="24"/>
+          <w:szCs w:val="24"/>
+        </w:rPr>
+      </w:pPr>
+      <w:r>
+        <w:rPr>
+          <w:rFonts w:ascii="Times New Roman" w:eastAsia="Times New Roman" w:hAnsi="Times New Roman" w:cs="Times New Roman"/>
+          <w:sz w:val="24"/>
+          <w:szCs w:val="24"/>
+        </w:rPr>
+        <w:t>Let's use the exact same graph from the BFS example to see how DFS behaves differently.</w:t>
+      </w:r>
+    </w:p>
+    <w:p>
+      <w:pPr>
+        <w:spacing w:before="100" w:beforeAutospacing="1" w:after="100" w:afterAutospacing="1" w:line="240" w:lineRule="auto"/>
+        <w:outlineLvl w:val="2"/>
+        <w:rPr>
+          <w:rFonts w:ascii="Times New Roman" w:eastAsia="Times New Roman" w:hAnsi="Times New Roman" w:cs="Times New Roman"/>
+          <w:b/>
+          <w:bCs/>
+          <w:sz w:val="27"/>
+          <w:szCs w:val="27"/>
+        </w:rPr>
+      </w:pPr>
+      <w:r>
+        <w:rPr>
+          <w:rFonts w:ascii="Times New Roman" w:eastAsia="Times New Roman" w:hAnsi="Times New Roman" w:cs="Times New Roman"/>
+          <w:b/>
+          <w:bCs/>
+          <w:sz w:val="27"/>
+          <w:szCs w:val="27"/>
+        </w:rPr>
+        <w:t>The Graph</w:t>
+      </w:r>
+    </w:p>
+    <w:p>
+      <w:pPr>
+        <w:numPr>
+          <w:ilvl w:val="0"/>
+          <w:numId w:val="6"/>
+        </w:numPr>
+        <w:spacing w:before="100" w:beforeAutospacing="1" w:after="100" w:afterAutospacing="1" w:line="240" w:lineRule="auto"/>
+        <w:rPr>
+          <w:rFonts w:ascii="Times New Roman" w:eastAsia="Times New Roman" w:hAnsi="Times New Roman" w:cs="Times New Roman"/>
+          <w:sz w:val="24"/>
+          <w:szCs w:val="24"/>
+        </w:rPr>
+      </w:pPr>
+      <w:r>
+        <w:rPr>
+          <w:rFonts w:ascii="Times New Roman" w:eastAsia="Times New Roman" w:hAnsi="Times New Roman" w:cs="Times New Roman"/>
+          <w:b/>
+          <w:bCs/>
+          <w:sz w:val="24"/>
+          <w:szCs w:val="24"/>
+        </w:rPr>
+        <w:t>A</w:t>
+      </w:r>
+      <w:r>
+        <w:rPr>
+          <w:rFonts w:ascii="Times New Roman" w:eastAsia="Times New Roman" w:hAnsi="Times New Roman" w:cs="Times New Roman"/>
+          <w:sz w:val="24"/>
+          <w:szCs w:val="24"/>
+        </w:rPr>
+        <w:t xml:space="preserve"> is connected to </w:t>
+      </w:r>
+      <w:r>
+        <w:rPr>
+          <w:rFonts w:ascii="Times New Roman" w:eastAsia="Times New Roman" w:hAnsi="Times New Roman" w:cs="Times New Roman"/>
+          <w:b/>
+          <w:bCs/>
+          <w:sz w:val="24"/>
+          <w:szCs w:val="24"/>
+        </w:rPr>
+        <w:t>B</w:t>
+      </w:r>
+      <w:r>
+        <w:rPr>
+          <w:rFonts w:ascii="Times New Roman" w:eastAsia="Times New Roman" w:hAnsi="Times New Roman" w:cs="Times New Roman"/>
+          <w:sz w:val="24"/>
+          <w:szCs w:val="24"/>
+        </w:rPr>
+        <w:t xml:space="preserve"> and </w:t>
+      </w:r>
+      <w:r>
+        <w:rPr>
+          <w:rFonts w:ascii="Times New Roman" w:eastAsia="Times New Roman" w:hAnsi="Times New Roman" w:cs="Times New Roman"/>
+          <w:b/>
+          <w:bCs/>
+          <w:sz w:val="24"/>
+          <w:szCs w:val="24"/>
+        </w:rPr>
+        <w:t>C</w:t>
+      </w:r>
+    </w:p>
+    <w:p>
+      <w:pPr>
+        <w:numPr>
+          <w:ilvl w:val="0"/>
+          <w:numId w:val="6"/>
+        </w:numPr>
+        <w:spacing w:before="100" w:beforeAutospacing="1" w:after="100" w:afterAutospacing="1" w:line="240" w:lineRule="auto"/>
+        <w:rPr>
+          <w:rFonts w:ascii="Times New Roman" w:eastAsia="Times New Roman" w:hAnsi="Times New Roman" w:cs="Times New Roman"/>
+          <w:sz w:val="24"/>
+          <w:szCs w:val="24"/>
+        </w:rPr>
+      </w:pPr>
+      <w:r>
+        <w:rPr>
+          <w:rFonts w:ascii="Times New Roman" w:eastAsia="Times New Roman" w:hAnsi="Times New Roman" w:cs="Times New Roman"/>
+          <w:b/>
+          <w:bCs/>
+          <w:sz w:val="24"/>
+          <w:szCs w:val="24"/>
+        </w:rPr>
+        <w:t>B</w:t>
+      </w:r>
+      <w:r>
+        <w:rPr>
+          <w:rFonts w:ascii="Times New Roman" w:eastAsia="Times New Roman" w:hAnsi="Times New Roman" w:cs="Times New Roman"/>
+          <w:sz w:val="24"/>
+          <w:szCs w:val="24"/>
+        </w:rPr>
+        <w:t xml:space="preserve"> is connected to </w:t>
+      </w:r>
+      <w:r>
+        <w:rPr>
+          <w:rFonts w:ascii="Times New Roman" w:eastAsia="Times New Roman" w:hAnsi="Times New Roman" w:cs="Times New Roman"/>
+          <w:b/>
+          <w:bCs/>
+          <w:sz w:val="24"/>
+          <w:szCs w:val="24"/>
+        </w:rPr>
+        <w:t>D</w:t>
+      </w:r>
+      <w:r>
+        <w:rPr>
+          <w:rFonts w:ascii="Times New Roman" w:eastAsia="Times New Roman" w:hAnsi="Times New Roman" w:cs="Times New Roman"/>
+          <w:sz w:val="24"/>
+          <w:szCs w:val="24"/>
+        </w:rPr>
+        <w:t xml:space="preserve"> and </w:t>
+      </w:r>
+      <w:r>
+        <w:rPr>
+          <w:rFonts w:ascii="Times New Roman" w:eastAsia="Times New Roman" w:hAnsi="Times New Roman" w:cs="Times New Roman"/>
+          <w:b/>
+          <w:bCs/>
+          <w:sz w:val="24"/>
+          <w:szCs w:val="24"/>
+        </w:rPr>
+        <w:t>E</w:t>
+      </w:r>
+    </w:p>
+    <w:p>
+      <w:pPr>
+        <w:numPr>
+          <w:ilvl w:val="0"/>
+          <w:numId w:val="6"/>
+        </w:numPr>
+        <w:spacing w:before="100" w:beforeAutospacing="1" w:after="100" w:afterAutospacing="1" w:line="240" w:lineRule="auto"/>
+        <w:rPr>
+          <w:rFonts w:ascii="Times New Roman" w:eastAsia="Times New Roman" w:hAnsi="Times New Roman" w:cs="Times New Roman"/>
+          <w:sz w:val="24"/>
+          <w:szCs w:val="24"/>
+        </w:rPr>
+      </w:pPr>
+      <w:r>
+        <w:rPr>
+          <w:rFonts w:ascii="Times New Roman" w:eastAsia="Times New Roman" w:hAnsi="Times New Roman" w:cs="Times New Roman"/>
+          <w:b/>
+          <w:bCs/>
+          <w:sz w:val="24"/>
+          <w:szCs w:val="24"/>
+        </w:rPr>
+        <w:t>C</w:t>
+      </w:r>
+      <w:r>
+        <w:rPr>
+          <w:rFonts w:ascii="Times New Roman" w:eastAsia="Times New Roman" w:hAnsi="Times New Roman" w:cs="Times New Roman"/>
+          <w:sz w:val="24"/>
+          <w:szCs w:val="24"/>
+        </w:rPr>
+        <w:t xml:space="preserve"> is connected to </w:t>
+      </w:r>
+      <w:r>
+        <w:rPr>
+          <w:rFonts w:ascii="Times New Roman" w:eastAsia="Times New Roman" w:hAnsi="Times New Roman" w:cs="Times New Roman"/>
+          <w:b/>
+          <w:bCs/>
+          <w:sz w:val="24"/>
+          <w:szCs w:val="24"/>
+        </w:rPr>
+        <w:t>F</w:t>
+      </w:r>
+    </w:p>
+    <w:p>
+      <w:pPr>
+        <w:spacing w:before="100" w:beforeAutospacing="1" w:after="100" w:afterAutospacing="1" w:line="240" w:lineRule="auto"/>
+        <w:outlineLvl w:val="2"/>
+        <w:rPr>
+          <w:rFonts w:ascii="Times New Roman" w:eastAsia="Times New Roman" w:hAnsi="Times New Roman" w:cs="Times New Roman"/>
+          <w:b/>
+          <w:bCs/>
+          <w:sz w:val="27"/>
+          <w:szCs w:val="27"/>
+        </w:rPr>
+      </w:pPr>
+      <w:r>
+        <w:rPr>
+          <w:rFonts w:ascii="Times New Roman" w:eastAsia="Times New Roman" w:hAnsi="Times New Roman" w:cs="Times New Roman"/>
+          <w:b/>
+          <w:bCs/>
+          <w:sz w:val="27"/>
+          <w:szCs w:val="27"/>
+        </w:rPr>
+        <w:t>Step-by-Step Execution (Recursive Approach) starting at Node A:</w:t>
+      </w:r>
+    </w:p>
+    <w:p>
+      <w:pPr>
+        <w:numPr>
+          <w:ilvl w:val="0"/>
+          <w:numId w:val="7"/>
+        </w:numPr>
+        <w:spacing w:before="100" w:beforeAutospacing="1" w:after="100" w:afterAutospacing="1" w:line="240" w:lineRule="auto"/>
+        <w:rPr>
+          <w:rFonts w:ascii="Times New Roman" w:eastAsia="Times New Roman" w:hAnsi="Times New Roman" w:cs="Times New Roman"/>
+          <w:sz w:val="24"/>
+          <w:szCs w:val="24"/>
+        </w:rPr>
+      </w:pPr>
+      <w:r>
+        <w:rPr>
+          <w:rFonts w:ascii="Times New Roman" w:eastAsia="Times New Roman" w:hAnsi="Times New Roman" w:cs="Times New Roman"/>
+          <w:b/>
+          <w:bCs/>
+          <w:sz w:val="24"/>
+          <w:szCs w:val="24"/>
+        </w:rPr>
+        <w:t>Visit A:</w:t>
+      </w:r>
+      <w:r>
+        <w:rPr>
+          <w:rFonts w:ascii="Times New Roman" w:eastAsia="Times New Roman" w:hAnsi="Times New Roman" w:cs="Times New Roman"/>
+          <w:sz w:val="24"/>
+          <w:szCs w:val="24"/>
+        </w:rPr>
+        <w:t xml:space="preserve"> Mark </w:t>
+      </w:r>
+      <w:r>
+        <w:rPr>
+          <w:rFonts w:ascii="Times New Roman" w:eastAsia="Times New Roman" w:hAnsi="Times New Roman" w:cs="Times New Roman"/>
+          <w:b/>
+          <w:bCs/>
+          <w:sz w:val="24"/>
+          <w:szCs w:val="24"/>
+        </w:rPr>
+        <w:t>A</w:t>
+      </w:r>
+      <w:r>
+        <w:rPr>
+          <w:rFonts w:ascii="Times New Roman" w:eastAsia="Times New Roman" w:hAnsi="Times New Roman" w:cs="Times New Roman"/>
+          <w:sz w:val="24"/>
+          <w:szCs w:val="24"/>
+        </w:rPr>
+        <w:t xml:space="preserve"> as visited. Look at its first neighbor, </w:t>
+      </w:r>
+      <w:r>
+        <w:rPr>
+          <w:rFonts w:ascii="Times New Roman" w:eastAsia="Times New Roman" w:hAnsi="Times New Roman" w:cs="Times New Roman"/>
+          <w:b/>
+          <w:bCs/>
+          <w:sz w:val="24"/>
+          <w:szCs w:val="24"/>
+        </w:rPr>
+        <w:t>B</w:t>
+      </w:r>
+      <w:r>
+        <w:rPr>
+          <w:rFonts w:ascii="Times New Roman" w:eastAsia="Times New Roman" w:hAnsi="Times New Roman" w:cs="Times New Roman"/>
+          <w:sz w:val="24"/>
+          <w:szCs w:val="24"/>
+        </w:rPr>
+        <w:t>.</w:t>
+      </w:r>
+    </w:p>
+    <w:p>
+      <w:pPr>
+        <w:numPr>
+          <w:ilvl w:val="0"/>
+          <w:numId w:val="7"/>
+        </w:numPr>
+        <w:spacing w:before="100" w:beforeAutospacing="1" w:after="100" w:afterAutospacing="1" w:line="240" w:lineRule="auto"/>
+        <w:rPr>
+          <w:rFonts w:ascii="Times New Roman" w:eastAsia="Times New Roman" w:hAnsi="Times New Roman" w:cs="Times New Roman"/>
+          <w:sz w:val="24"/>
+          <w:szCs w:val="24"/>
+        </w:rPr>
+      </w:pPr>
+      <w:r>
+        <w:rPr>
+          <w:rFonts w:ascii="Times New Roman" w:eastAsia="Times New Roman" w:hAnsi="Times New Roman" w:cs="Times New Roman"/>
+          <w:b/>
+          <w:bCs/>
+          <w:sz w:val="24"/>
+          <w:szCs w:val="24"/>
+        </w:rPr>
+        <w:t>Dive into B:</w:t>
+      </w:r>
+      <w:r>
+        <w:rPr>
+          <w:rFonts w:ascii="Times New Roman" w:eastAsia="Times New Roman" w:hAnsi="Times New Roman" w:cs="Times New Roman"/>
+          <w:sz w:val="24"/>
+          <w:szCs w:val="24"/>
+        </w:rPr>
+        <w:t xml:space="preserve"> Since </w:t>
+      </w:r>
+      <w:r>
+        <w:rPr>
+          <w:rFonts w:ascii="Times New Roman" w:eastAsia="Times New Roman" w:hAnsi="Times New Roman" w:cs="Times New Roman"/>
+          <w:b/>
+          <w:bCs/>
+          <w:sz w:val="24"/>
+          <w:szCs w:val="24"/>
+        </w:rPr>
+        <w:t>B</w:t>
+      </w:r>
+      <w:r>
+        <w:rPr>
+          <w:rFonts w:ascii="Times New Roman" w:eastAsia="Times New Roman" w:hAnsi="Times New Roman" w:cs="Times New Roman"/>
+          <w:sz w:val="24"/>
+          <w:szCs w:val="24"/>
+        </w:rPr>
+        <w:t xml:space="preserve"> is unvisited, we immediately </w:t>
+      </w:r>
+      <w:proofErr w:type="gramStart"/>
+      <w:r>
+        <w:rPr>
+          <w:rFonts w:ascii="Times New Roman" w:eastAsia="Times New Roman" w:hAnsi="Times New Roman" w:cs="Times New Roman"/>
+          <w:sz w:val="24"/>
+          <w:szCs w:val="24"/>
+        </w:rPr>
+        <w:t>pause</w:t>
+      </w:r>
+      <w:proofErr w:type="gramEnd"/>
+      <w:r>
+        <w:rPr>
+          <w:rFonts w:ascii="Times New Roman" w:eastAsia="Times New Roman" w:hAnsi="Times New Roman" w:cs="Times New Roman"/>
+          <w:sz w:val="24"/>
+          <w:szCs w:val="24"/>
+        </w:rPr>
+        <w:t xml:space="preserve"> our exploration of A's other neighbors and jump into </w:t>
+      </w:r>
+      <w:r>
+        <w:rPr>
+          <w:rFonts w:ascii="Times New Roman" w:eastAsia="Times New Roman" w:hAnsi="Times New Roman" w:cs="Times New Roman"/>
+          <w:b/>
+          <w:bCs/>
+          <w:sz w:val="24"/>
+          <w:szCs w:val="24"/>
+        </w:rPr>
+        <w:t>B</w:t>
+      </w:r>
+      <w:r>
+        <w:rPr>
+          <w:rFonts w:ascii="Times New Roman" w:eastAsia="Times New Roman" w:hAnsi="Times New Roman" w:cs="Times New Roman"/>
+          <w:sz w:val="24"/>
+          <w:szCs w:val="24"/>
+        </w:rPr>
+        <w:t xml:space="preserve">. Mark </w:t>
+      </w:r>
+      <w:r>
+        <w:rPr>
+          <w:rFonts w:ascii="Times New Roman" w:eastAsia="Times New Roman" w:hAnsi="Times New Roman" w:cs="Times New Roman"/>
+          <w:b/>
+          <w:bCs/>
+          <w:sz w:val="24"/>
+          <w:szCs w:val="24"/>
+        </w:rPr>
+        <w:t>B</w:t>
+      </w:r>
+      <w:r>
+        <w:rPr>
+          <w:rFonts w:ascii="Times New Roman" w:eastAsia="Times New Roman" w:hAnsi="Times New Roman" w:cs="Times New Roman"/>
+          <w:sz w:val="24"/>
+          <w:szCs w:val="24"/>
+        </w:rPr>
+        <w:t xml:space="preserve"> as visited. Look at B's neighbors: </w:t>
+      </w:r>
+      <w:r>
+        <w:rPr>
+          <w:rFonts w:ascii="Times New Roman" w:eastAsia="Times New Roman" w:hAnsi="Times New Roman" w:cs="Times New Roman"/>
+          <w:b/>
+          <w:bCs/>
+          <w:sz w:val="24"/>
+          <w:szCs w:val="24"/>
+        </w:rPr>
+        <w:t>D</w:t>
+      </w:r>
+      <w:r>
+        <w:rPr>
+          <w:rFonts w:ascii="Times New Roman" w:eastAsia="Times New Roman" w:hAnsi="Times New Roman" w:cs="Times New Roman"/>
+          <w:sz w:val="24"/>
+          <w:szCs w:val="24"/>
+        </w:rPr>
+        <w:t xml:space="preserve"> and </w:t>
+      </w:r>
+      <w:r>
+        <w:rPr>
+          <w:rFonts w:ascii="Times New Roman" w:eastAsia="Times New Roman" w:hAnsi="Times New Roman" w:cs="Times New Roman"/>
+          <w:b/>
+          <w:bCs/>
+          <w:sz w:val="24"/>
+          <w:szCs w:val="24"/>
+        </w:rPr>
+        <w:t>E</w:t>
+      </w:r>
+      <w:r>
+        <w:rPr>
+          <w:rFonts w:ascii="Times New Roman" w:eastAsia="Times New Roman" w:hAnsi="Times New Roman" w:cs="Times New Roman"/>
+          <w:sz w:val="24"/>
+          <w:szCs w:val="24"/>
+        </w:rPr>
+        <w:t>.</w:t>
+      </w:r>
+    </w:p>
+    <w:p>
+      <w:pPr>
+        <w:numPr>
+          <w:ilvl w:val="0"/>
+          <w:numId w:val="7"/>
+        </w:numPr>
+        <w:spacing w:before="100" w:beforeAutospacing="1" w:after="100" w:afterAutospacing="1" w:line="240" w:lineRule="auto"/>
+        <w:rPr>
+          <w:rFonts w:ascii="Times New Roman" w:eastAsia="Times New Roman" w:hAnsi="Times New Roman" w:cs="Times New Roman"/>
+          <w:sz w:val="24"/>
+          <w:szCs w:val="24"/>
+        </w:rPr>
+      </w:pPr>
+      <w:r>
+        <w:rPr>
+          <w:rFonts w:ascii="Times New Roman" w:eastAsia="Times New Roman" w:hAnsi="Times New Roman" w:cs="Times New Roman"/>
+          <w:b/>
+          <w:bCs/>
+          <w:sz w:val="24"/>
+          <w:szCs w:val="24"/>
+        </w:rPr>
+        <w:t>Dive into D:</w:t>
+      </w:r>
+      <w:r>
+        <w:rPr>
+          <w:rFonts w:ascii="Times New Roman" w:eastAsia="Times New Roman" w:hAnsi="Times New Roman" w:cs="Times New Roman"/>
+          <w:sz w:val="24"/>
+          <w:szCs w:val="24"/>
+        </w:rPr>
+        <w:t xml:space="preserve"> Since </w:t>
+      </w:r>
+      <w:r>
+        <w:rPr>
+          <w:rFonts w:ascii="Times New Roman" w:eastAsia="Times New Roman" w:hAnsi="Times New Roman" w:cs="Times New Roman"/>
+          <w:b/>
+          <w:bCs/>
+          <w:sz w:val="24"/>
+          <w:szCs w:val="24"/>
+        </w:rPr>
+        <w:t>D</w:t>
+      </w:r>
+      <w:r>
+        <w:rPr>
+          <w:rFonts w:ascii="Times New Roman" w:eastAsia="Times New Roman" w:hAnsi="Times New Roman" w:cs="Times New Roman"/>
+          <w:sz w:val="24"/>
+          <w:szCs w:val="24"/>
+        </w:rPr>
+        <w:t xml:space="preserve"> is unvisited, jump into </w:t>
+      </w:r>
+      <w:r>
+        <w:rPr>
+          <w:rFonts w:ascii="Times New Roman" w:eastAsia="Times New Roman" w:hAnsi="Times New Roman" w:cs="Times New Roman"/>
+          <w:b/>
+          <w:bCs/>
+          <w:sz w:val="24"/>
+          <w:szCs w:val="24"/>
+        </w:rPr>
+        <w:t>D</w:t>
+      </w:r>
+      <w:r>
+        <w:rPr>
+          <w:rFonts w:ascii="Times New Roman" w:eastAsia="Times New Roman" w:hAnsi="Times New Roman" w:cs="Times New Roman"/>
+          <w:sz w:val="24"/>
+          <w:szCs w:val="24"/>
+        </w:rPr>
+        <w:t xml:space="preserve">. Mark </w:t>
+      </w:r>
+      <w:r>
+        <w:rPr>
+          <w:rFonts w:ascii="Times New Roman" w:eastAsia="Times New Roman" w:hAnsi="Times New Roman" w:cs="Times New Roman"/>
+          <w:b/>
+          <w:bCs/>
+          <w:sz w:val="24"/>
+          <w:szCs w:val="24"/>
+        </w:rPr>
+        <w:t>D</w:t>
+      </w:r>
+      <w:r>
+        <w:rPr>
+          <w:rFonts w:ascii="Times New Roman" w:eastAsia="Times New Roman" w:hAnsi="Times New Roman" w:cs="Times New Roman"/>
+          <w:sz w:val="24"/>
+          <w:szCs w:val="24"/>
+        </w:rPr>
+        <w:t xml:space="preserve"> as visited.</w:t>
+      </w:r>
+    </w:p>
+    <w:p>
+      <w:pPr>
+        <w:numPr>
+          <w:ilvl w:val="0"/>
+          <w:numId w:val="7"/>
+        </w:numPr>
+        <w:spacing w:before="100" w:beforeAutospacing="1" w:after="100" w:afterAutospacing="1" w:line="240" w:lineRule="auto"/>
+        <w:rPr>
+          <w:rFonts w:ascii="Times New Roman" w:eastAsia="Times New Roman" w:hAnsi="Times New Roman" w:cs="Times New Roman"/>
+          <w:sz w:val="24"/>
+          <w:szCs w:val="24"/>
+        </w:rPr>
+      </w:pPr>
+      <w:r>
+        <w:rPr>
+          <w:rFonts w:ascii="Times New Roman" w:eastAsia="Times New Roman" w:hAnsi="Times New Roman" w:cs="Times New Roman"/>
+          <w:b/>
+          <w:bCs/>
+          <w:sz w:val="24"/>
+          <w:szCs w:val="24"/>
+        </w:rPr>
+        <w:t>Dead End &amp; Backtrack:</w:t>
+      </w:r>
+      <w:r>
+        <w:rPr>
+          <w:rFonts w:ascii="Times New Roman" w:eastAsia="Times New Roman" w:hAnsi="Times New Roman" w:cs="Times New Roman"/>
+          <w:sz w:val="24"/>
+          <w:szCs w:val="24"/>
+        </w:rPr>
+        <w:t xml:space="preserve"> </w:t>
+      </w:r>
+      <w:r>
+        <w:rPr>
+          <w:rFonts w:ascii="Times New Roman" w:eastAsia="Times New Roman" w:hAnsi="Times New Roman" w:cs="Times New Roman"/>
+          <w:b/>
+          <w:bCs/>
+          <w:sz w:val="24"/>
+          <w:szCs w:val="24"/>
+        </w:rPr>
+        <w:t>D</w:t>
+      </w:r>
+      <w:r>
+        <w:rPr>
+          <w:rFonts w:ascii="Times New Roman" w:eastAsia="Times New Roman" w:hAnsi="Times New Roman" w:cs="Times New Roman"/>
+          <w:sz w:val="24"/>
+          <w:szCs w:val="24"/>
+        </w:rPr>
+        <w:t xml:space="preserve"> has no other unvisited neighbors. We hit a dead end, so we backtrack up to </w:t>
+      </w:r>
+      <w:r>
+        <w:rPr>
+          <w:rFonts w:ascii="Times New Roman" w:eastAsia="Times New Roman" w:hAnsi="Times New Roman" w:cs="Times New Roman"/>
+          <w:b/>
+          <w:bCs/>
+          <w:sz w:val="24"/>
+          <w:szCs w:val="24"/>
+        </w:rPr>
+        <w:t>B</w:t>
+      </w:r>
+      <w:r>
+        <w:rPr>
+          <w:rFonts w:ascii="Times New Roman" w:eastAsia="Times New Roman" w:hAnsi="Times New Roman" w:cs="Times New Roman"/>
+          <w:sz w:val="24"/>
+          <w:szCs w:val="24"/>
+        </w:rPr>
+        <w:t>.</w:t>
+      </w:r>
+    </w:p>
+    <w:p>
+      <w:pPr>
+        <w:numPr>
+          <w:ilvl w:val="0"/>
+          <w:numId w:val="7"/>
+        </w:numPr>
+        <w:spacing w:before="100" w:beforeAutospacing="1" w:after="100" w:afterAutospacing="1" w:line="240" w:lineRule="auto"/>
+        <w:rPr>
+          <w:rFonts w:ascii="Times New Roman" w:eastAsia="Times New Roman" w:hAnsi="Times New Roman" w:cs="Times New Roman"/>
+          <w:sz w:val="24"/>
+          <w:szCs w:val="24"/>
+        </w:rPr>
+      </w:pPr>
+      <w:r>
+        <w:rPr>
+          <w:rFonts w:ascii="Times New Roman" w:eastAsia="Times New Roman" w:hAnsi="Times New Roman" w:cs="Times New Roman"/>
+          <w:b/>
+          <w:bCs/>
+          <w:sz w:val="24"/>
+          <w:szCs w:val="24"/>
+        </w:rPr>
+        <w:t>Dive into E:</w:t>
+      </w:r>
+      <w:r>
+        <w:rPr>
+          <w:rFonts w:ascii="Times New Roman" w:eastAsia="Times New Roman" w:hAnsi="Times New Roman" w:cs="Times New Roman"/>
+          <w:sz w:val="24"/>
+          <w:szCs w:val="24"/>
+        </w:rPr>
+        <w:t xml:space="preserve"> Back at </w:t>
+      </w:r>
+      <w:r>
+        <w:rPr>
+          <w:rFonts w:ascii="Times New Roman" w:eastAsia="Times New Roman" w:hAnsi="Times New Roman" w:cs="Times New Roman"/>
+          <w:b/>
+          <w:bCs/>
+          <w:sz w:val="24"/>
+          <w:szCs w:val="24"/>
+        </w:rPr>
+        <w:t>B</w:t>
+      </w:r>
+      <w:r>
+        <w:rPr>
+          <w:rFonts w:ascii="Times New Roman" w:eastAsia="Times New Roman" w:hAnsi="Times New Roman" w:cs="Times New Roman"/>
+          <w:sz w:val="24"/>
+          <w:szCs w:val="24"/>
+        </w:rPr>
+        <w:t xml:space="preserve">, we check its next unvisited neighbor, </w:t>
+      </w:r>
+      <w:r>
+        <w:rPr>
+          <w:rFonts w:ascii="Times New Roman" w:eastAsia="Times New Roman" w:hAnsi="Times New Roman" w:cs="Times New Roman"/>
+          <w:b/>
+          <w:bCs/>
+          <w:sz w:val="24"/>
+          <w:szCs w:val="24"/>
+        </w:rPr>
+        <w:t>E</w:t>
+      </w:r>
+      <w:r>
+        <w:rPr>
+          <w:rFonts w:ascii="Times New Roman" w:eastAsia="Times New Roman" w:hAnsi="Times New Roman" w:cs="Times New Roman"/>
+          <w:sz w:val="24"/>
+          <w:szCs w:val="24"/>
+        </w:rPr>
+        <w:t xml:space="preserve">. Jump into </w:t>
+      </w:r>
+      <w:r>
+        <w:rPr>
+          <w:rFonts w:ascii="Times New Roman" w:eastAsia="Times New Roman" w:hAnsi="Times New Roman" w:cs="Times New Roman"/>
+          <w:b/>
+          <w:bCs/>
+          <w:sz w:val="24"/>
+          <w:szCs w:val="24"/>
+        </w:rPr>
+        <w:t>E</w:t>
+      </w:r>
+      <w:r>
+        <w:rPr>
+          <w:rFonts w:ascii="Times New Roman" w:eastAsia="Times New Roman" w:hAnsi="Times New Roman" w:cs="Times New Roman"/>
+          <w:sz w:val="24"/>
+          <w:szCs w:val="24"/>
+        </w:rPr>
+        <w:t xml:space="preserve"> and mark it as visited.</w:t>
+      </w:r>
+    </w:p>
+    <w:p>
+      <w:pPr>
+        <w:numPr>
+          <w:ilvl w:val="0"/>
+          <w:numId w:val="7"/>
+        </w:numPr>
+        <w:spacing w:before="100" w:beforeAutospacing="1" w:after="100" w:afterAutospacing="1" w:line="240" w:lineRule="auto"/>
+        <w:rPr>
+          <w:rFonts w:ascii="Times New Roman" w:eastAsia="Times New Roman" w:hAnsi="Times New Roman" w:cs="Times New Roman"/>
+          <w:sz w:val="24"/>
+          <w:szCs w:val="24"/>
+        </w:rPr>
+      </w:pPr>
+      <w:r>
+        <w:rPr>
+          <w:rFonts w:ascii="Times New Roman" w:eastAsia="Times New Roman" w:hAnsi="Times New Roman" w:cs="Times New Roman"/>
+          <w:b/>
+          <w:bCs/>
+          <w:sz w:val="24"/>
+          <w:szCs w:val="24"/>
+        </w:rPr>
+        <w:t>Dead End &amp; Backtrack:</w:t>
+      </w:r>
+      <w:r>
+        <w:rPr>
+          <w:rFonts w:ascii="Times New Roman" w:eastAsia="Times New Roman" w:hAnsi="Times New Roman" w:cs="Times New Roman"/>
+          <w:sz w:val="24"/>
+          <w:szCs w:val="24"/>
+        </w:rPr>
+        <w:t xml:space="preserve"> </w:t>
+      </w:r>
+      <w:r>
+        <w:rPr>
+          <w:rFonts w:ascii="Times New Roman" w:eastAsia="Times New Roman" w:hAnsi="Times New Roman" w:cs="Times New Roman"/>
+          <w:b/>
+          <w:bCs/>
+          <w:sz w:val="24"/>
+          <w:szCs w:val="24"/>
+        </w:rPr>
+        <w:t>E</w:t>
+      </w:r>
+      <w:r>
+        <w:rPr>
+          <w:rFonts w:ascii="Times New Roman" w:eastAsia="Times New Roman" w:hAnsi="Times New Roman" w:cs="Times New Roman"/>
+          <w:sz w:val="24"/>
+          <w:szCs w:val="24"/>
+        </w:rPr>
+        <w:t xml:space="preserve"> has no unvisited neighbors. Backtrack to </w:t>
+      </w:r>
+      <w:r>
+        <w:rPr>
+          <w:rFonts w:ascii="Times New Roman" w:eastAsia="Times New Roman" w:hAnsi="Times New Roman" w:cs="Times New Roman"/>
+          <w:b/>
+          <w:bCs/>
+          <w:sz w:val="24"/>
+          <w:szCs w:val="24"/>
+        </w:rPr>
+        <w:t>B</w:t>
+      </w:r>
+      <w:r>
+        <w:rPr>
+          <w:rFonts w:ascii="Times New Roman" w:eastAsia="Times New Roman" w:hAnsi="Times New Roman" w:cs="Times New Roman"/>
+          <w:sz w:val="24"/>
+          <w:szCs w:val="24"/>
+        </w:rPr>
+        <w:t xml:space="preserve">. </w:t>
+      </w:r>
+      <w:r>
+        <w:rPr>
+          <w:rFonts w:ascii="Times New Roman" w:eastAsia="Times New Roman" w:hAnsi="Times New Roman" w:cs="Times New Roman"/>
+          <w:b/>
+          <w:bCs/>
+          <w:sz w:val="24"/>
+          <w:szCs w:val="24"/>
+        </w:rPr>
+        <w:t>B</w:t>
+      </w:r>
+      <w:r>
+        <w:rPr>
+          <w:rFonts w:ascii="Times New Roman" w:eastAsia="Times New Roman" w:hAnsi="Times New Roman" w:cs="Times New Roman"/>
+          <w:sz w:val="24"/>
+          <w:szCs w:val="24"/>
+        </w:rPr>
+        <w:t xml:space="preserve"> has no more unvisited neighbors. Backtrack all the way to </w:t>
+      </w:r>
+      <w:r>
+        <w:rPr>
+          <w:rFonts w:ascii="Times New Roman" w:eastAsia="Times New Roman" w:hAnsi="Times New Roman" w:cs="Times New Roman"/>
+          <w:b/>
+          <w:bCs/>
+          <w:sz w:val="24"/>
+          <w:szCs w:val="24"/>
+        </w:rPr>
+        <w:t>A</w:t>
+      </w:r>
+      <w:r>
+        <w:rPr>
+          <w:rFonts w:ascii="Times New Roman" w:eastAsia="Times New Roman" w:hAnsi="Times New Roman" w:cs="Times New Roman"/>
+          <w:sz w:val="24"/>
+          <w:szCs w:val="24"/>
+        </w:rPr>
+        <w:t>.</w:t>
+      </w:r>
+    </w:p>
+    <w:p>
+      <w:pPr>
+        <w:numPr>
+          <w:ilvl w:val="0"/>
+          <w:numId w:val="7"/>
+        </w:numPr>
+        <w:spacing w:before="100" w:beforeAutospacing="1" w:after="100" w:afterAutospacing="1" w:line="240" w:lineRule="auto"/>
+        <w:rPr>
+          <w:rFonts w:ascii="Times New Roman" w:eastAsia="Times New Roman" w:hAnsi="Times New Roman" w:cs="Times New Roman"/>
+          <w:sz w:val="24"/>
+          <w:szCs w:val="24"/>
+        </w:rPr>
+      </w:pPr>
+      <w:r>
+        <w:rPr>
+          <w:rFonts w:ascii="Times New Roman" w:eastAsia="Times New Roman" w:hAnsi="Times New Roman" w:cs="Times New Roman"/>
+          <w:b/>
+          <w:bCs/>
+          <w:sz w:val="24"/>
+          <w:szCs w:val="24"/>
+        </w:rPr>
+        <w:t>Dive into C:</w:t>
+      </w:r>
+      <w:r>
+        <w:rPr>
+          <w:rFonts w:ascii="Times New Roman" w:eastAsia="Times New Roman" w:hAnsi="Times New Roman" w:cs="Times New Roman"/>
+          <w:sz w:val="24"/>
+          <w:szCs w:val="24"/>
+        </w:rPr>
+        <w:t xml:space="preserve"> Now back at </w:t>
+      </w:r>
+      <w:r>
+        <w:rPr>
+          <w:rFonts w:ascii="Times New Roman" w:eastAsia="Times New Roman" w:hAnsi="Times New Roman" w:cs="Times New Roman"/>
+          <w:b/>
+          <w:bCs/>
+          <w:sz w:val="24"/>
+          <w:szCs w:val="24"/>
+        </w:rPr>
+        <w:t>A</w:t>
+      </w:r>
+      <w:r>
+        <w:rPr>
+          <w:rFonts w:ascii="Times New Roman" w:eastAsia="Times New Roman" w:hAnsi="Times New Roman" w:cs="Times New Roman"/>
+          <w:sz w:val="24"/>
+          <w:szCs w:val="24"/>
+        </w:rPr>
+        <w:t xml:space="preserve">, we finally look at its second neighbor, </w:t>
+      </w:r>
+      <w:r>
+        <w:rPr>
+          <w:rFonts w:ascii="Times New Roman" w:eastAsia="Times New Roman" w:hAnsi="Times New Roman" w:cs="Times New Roman"/>
+          <w:b/>
+          <w:bCs/>
+          <w:sz w:val="24"/>
+          <w:szCs w:val="24"/>
+        </w:rPr>
+        <w:t>C</w:t>
+      </w:r>
+      <w:r>
+        <w:rPr>
+          <w:rFonts w:ascii="Times New Roman" w:eastAsia="Times New Roman" w:hAnsi="Times New Roman" w:cs="Times New Roman"/>
+          <w:sz w:val="24"/>
+          <w:szCs w:val="24"/>
+        </w:rPr>
+        <w:t xml:space="preserve">. Jump into </w:t>
+      </w:r>
+      <w:r>
+        <w:rPr>
+          <w:rFonts w:ascii="Times New Roman" w:eastAsia="Times New Roman" w:hAnsi="Times New Roman" w:cs="Times New Roman"/>
+          <w:b/>
+          <w:bCs/>
+          <w:sz w:val="24"/>
+          <w:szCs w:val="24"/>
+        </w:rPr>
+        <w:t>C</w:t>
+      </w:r>
+      <w:r>
+        <w:rPr>
+          <w:rFonts w:ascii="Times New Roman" w:eastAsia="Times New Roman" w:hAnsi="Times New Roman" w:cs="Times New Roman"/>
+          <w:sz w:val="24"/>
+          <w:szCs w:val="24"/>
+        </w:rPr>
+        <w:t xml:space="preserve"> and mark it visited.</w:t>
+      </w:r>
+    </w:p>
+    <w:p>
+      <w:pPr>
+        <w:numPr>
+          <w:ilvl w:val="0"/>
+          <w:numId w:val="7"/>
+        </w:numPr>
+        <w:spacing w:before="100" w:beforeAutospacing="1" w:after="100" w:afterAutospacing="1" w:line="240" w:lineRule="auto"/>
+        <w:rPr>
+          <w:rFonts w:ascii="Times New Roman" w:eastAsia="Times New Roman" w:hAnsi="Times New Roman" w:cs="Times New Roman"/>
+          <w:sz w:val="24"/>
+          <w:szCs w:val="24"/>
+        </w:rPr>
+      </w:pPr>
+      <w:r>
+        <w:rPr>
+          <w:rFonts w:ascii="Times New Roman" w:eastAsia="Times New Roman" w:hAnsi="Times New Roman" w:cs="Times New Roman"/>
+          <w:b/>
+          <w:bCs/>
+          <w:sz w:val="24"/>
+          <w:szCs w:val="24"/>
+        </w:rPr>
+        <w:t>Dive into F:</w:t>
+      </w:r>
+      <w:r>
+        <w:rPr>
+          <w:rFonts w:ascii="Times New Roman" w:eastAsia="Times New Roman" w:hAnsi="Times New Roman" w:cs="Times New Roman"/>
+          <w:sz w:val="24"/>
+          <w:szCs w:val="24"/>
+        </w:rPr>
+        <w:t xml:space="preserve"> From </w:t>
+      </w:r>
+      <w:r>
+        <w:rPr>
+          <w:rFonts w:ascii="Times New Roman" w:eastAsia="Times New Roman" w:hAnsi="Times New Roman" w:cs="Times New Roman"/>
+          <w:b/>
+          <w:bCs/>
+          <w:sz w:val="24"/>
+          <w:szCs w:val="24"/>
+        </w:rPr>
+        <w:t>C</w:t>
+      </w:r>
+      <w:r>
+        <w:rPr>
+          <w:rFonts w:ascii="Times New Roman" w:eastAsia="Times New Roman" w:hAnsi="Times New Roman" w:cs="Times New Roman"/>
+          <w:sz w:val="24"/>
+          <w:szCs w:val="24"/>
+        </w:rPr>
+        <w:t xml:space="preserve">, jump into its unvisited neighbor </w:t>
+      </w:r>
+      <w:r>
+        <w:rPr>
+          <w:rFonts w:ascii="Times New Roman" w:eastAsia="Times New Roman" w:hAnsi="Times New Roman" w:cs="Times New Roman"/>
+          <w:b/>
+          <w:bCs/>
+          <w:sz w:val="24"/>
+          <w:szCs w:val="24"/>
+        </w:rPr>
+        <w:t>F</w:t>
+      </w:r>
+      <w:r>
+        <w:rPr>
+          <w:rFonts w:ascii="Times New Roman" w:eastAsia="Times New Roman" w:hAnsi="Times New Roman" w:cs="Times New Roman"/>
+          <w:sz w:val="24"/>
+          <w:szCs w:val="24"/>
+        </w:rPr>
+        <w:t xml:space="preserve"> and mark it visited.</w:t>
+      </w:r>
+    </w:p>
+    <w:p>
+      <w:pPr>
+        <w:numPr>
+          <w:ilvl w:val="0"/>
+          <w:numId w:val="7"/>
+        </w:numPr>
+        <w:spacing w:before="100" w:beforeAutospacing="1" w:after="100" w:afterAutospacing="1" w:line="240" w:lineRule="auto"/>
+        <w:rPr>
+          <w:rFonts w:ascii="Times New Roman" w:eastAsia="Times New Roman" w:hAnsi="Times New Roman" w:cs="Times New Roman"/>
+          <w:sz w:val="24"/>
+          <w:szCs w:val="24"/>
+        </w:rPr>
+      </w:pPr>
+      <w:r>
+        <w:rPr>
+          <w:rFonts w:ascii="Times New Roman" w:eastAsia="Times New Roman" w:hAnsi="Times New Roman" w:cs="Times New Roman"/>
+          <w:b/>
+          <w:bCs/>
+          <w:sz w:val="24"/>
+          <w:szCs w:val="24"/>
+        </w:rPr>
+        <w:t>Finish:</w:t>
+      </w:r>
+      <w:r>
+        <w:rPr>
+          <w:rFonts w:ascii="Times New Roman" w:eastAsia="Times New Roman" w:hAnsi="Times New Roman" w:cs="Times New Roman"/>
+          <w:sz w:val="24"/>
+          <w:szCs w:val="24"/>
+        </w:rPr>
+        <w:t xml:space="preserve"> </w:t>
+      </w:r>
+      <w:r>
+        <w:rPr>
+          <w:rFonts w:ascii="Times New Roman" w:eastAsia="Times New Roman" w:hAnsi="Times New Roman" w:cs="Times New Roman"/>
+          <w:b/>
+          <w:bCs/>
+          <w:sz w:val="24"/>
+          <w:szCs w:val="24"/>
+        </w:rPr>
+        <w:t>F</w:t>
+      </w:r>
+      <w:r>
+        <w:rPr>
+          <w:rFonts w:ascii="Times New Roman" w:eastAsia="Times New Roman" w:hAnsi="Times New Roman" w:cs="Times New Roman"/>
+          <w:sz w:val="24"/>
+          <w:szCs w:val="24"/>
+        </w:rPr>
+        <w:t xml:space="preserve"> is a dead end. Backtrack to </w:t>
+      </w:r>
+      <w:r>
+        <w:rPr>
+          <w:rFonts w:ascii="Times New Roman" w:eastAsia="Times New Roman" w:hAnsi="Times New Roman" w:cs="Times New Roman"/>
+          <w:b/>
+          <w:bCs/>
+          <w:sz w:val="24"/>
+          <w:szCs w:val="24"/>
+        </w:rPr>
+        <w:t>C</w:t>
+      </w:r>
+      <w:r>
+        <w:rPr>
+          <w:rFonts w:ascii="Times New Roman" w:eastAsia="Times New Roman" w:hAnsi="Times New Roman" w:cs="Times New Roman"/>
+          <w:sz w:val="24"/>
+          <w:szCs w:val="24"/>
+        </w:rPr>
+        <w:t xml:space="preserve">, then to </w:t>
+      </w:r>
+      <w:r>
+        <w:rPr>
+          <w:rFonts w:ascii="Times New Roman" w:eastAsia="Times New Roman" w:hAnsi="Times New Roman" w:cs="Times New Roman"/>
+          <w:b/>
+          <w:bCs/>
+          <w:sz w:val="24"/>
+          <w:szCs w:val="24"/>
+        </w:rPr>
+        <w:t>A</w:t>
+      </w:r>
+      <w:r>
+        <w:rPr>
+          <w:rFonts w:ascii="Times New Roman" w:eastAsia="Times New Roman" w:hAnsi="Times New Roman" w:cs="Times New Roman"/>
+          <w:sz w:val="24"/>
+          <w:szCs w:val="24"/>
+        </w:rPr>
+        <w:t>. The stack is empty, and we are done.</w:t>
+      </w:r>
+    </w:p>
+    <w:p>
+      <w:pPr>
+        <w:spacing w:before="100" w:beforeAutospacing="1" w:after="100" w:afterAutospacing="1" w:line="240" w:lineRule="auto"/>
+        <w:rPr>
+          <w:rFonts w:ascii="Times New Roman" w:eastAsia="Times New Roman" w:hAnsi="Times New Roman" w:cs="Times New Roman"/>
+          <w:sz w:val="24"/>
+          <w:szCs w:val="24"/>
+        </w:rPr>
+      </w:pPr>
+      <w:r>
+        <w:rPr>
+          <w:rFonts w:ascii="Times New Roman" w:eastAsia="Times New Roman" w:hAnsi="Times New Roman" w:cs="Times New Roman"/>
+          <w:b/>
+          <w:bCs/>
+          <w:sz w:val="24"/>
+          <w:szCs w:val="24"/>
+        </w:rPr>
+        <w:t>Final DFS Traversal Order:</w:t>
+      </w:r>
+      <w:r>
+        <w:rPr>
+          <w:rFonts w:ascii="Times New Roman" w:eastAsia="Times New Roman" w:hAnsi="Times New Roman" w:cs="Times New Roman"/>
+          <w:sz w:val="24"/>
+          <w:szCs w:val="24"/>
+        </w:rPr>
+        <w:t xml:space="preserve"> </w:t>
+      </w:r>
+      <w:r>
+        <w:rPr>
+          <w:rFonts w:ascii="Courier New" w:eastAsia="Times New Roman" w:hAnsi="Courier New" w:cs="Courier New"/>
+          <w:sz w:val="20"/>
+        </w:rPr>
+        <w:t>[</w:t>
+      </w:r>
+      <w:proofErr w:type="gramStart"/>
+      <w:r>
+        <w:rPr>
+          <w:rFonts w:ascii="Courier New" w:eastAsia="Times New Roman" w:hAnsi="Courier New" w:cs="Courier New"/>
+          <w:sz w:val="20"/>
+        </w:rPr>
+        <w:t>'A</w:t>
+      </w:r>
+      <w:proofErr w:type="gramEnd"/>
+      <w:r>
+        <w:rPr>
+          <w:rFonts w:ascii="Courier New" w:eastAsia="Times New Roman" w:hAnsi="Courier New" w:cs="Courier New"/>
+          <w:sz w:val="20"/>
+        </w:rPr>
+        <w:t>', 'B', 'D', 'E', 'C', 'F']</w:t>
+      </w:r>
+      <w:r>
+        <w:rPr>
+          <w:rFonts w:ascii="Times New Roman" w:eastAsia="Times New Roman" w:hAnsi="Times New Roman" w:cs="Times New Roman"/>
+          <w:sz w:val="24"/>
+          <w:szCs w:val="24"/>
+        </w:rPr>
+        <w:t xml:space="preserve"> </w:t>
+      </w:r>
+      <w:r>
+        <w:rPr>
+          <w:rFonts w:ascii="Times New Roman" w:eastAsia="Times New Roman" w:hAnsi="Times New Roman" w:cs="Times New Roman"/>
+          <w:i/>
+          <w:iCs/>
+          <w:sz w:val="24"/>
+          <w:szCs w:val="24"/>
+        </w:rPr>
+        <w:t>(Notice how it completely finished the B-branch before ever looking at C!)</w:t>
+      </w:r>
+    </w:p>
+    <w:p>
+      <w:pPr>
+        <w:spacing w:before="100" w:beforeAutospacing="1" w:after="100" w:afterAutospacing="1" w:line="240" w:lineRule="auto"/>
+        <w:outlineLvl w:val="1"/>
+        <w:rPr>
+          <w:rFonts w:ascii="Times New Roman" w:eastAsia="Times New Roman" w:hAnsi="Times New Roman" w:cs="Times New Roman"/>
+          <w:b/>
+          <w:bCs/>
+          <w:sz w:val="36"/>
+          <w:szCs w:val="36"/>
+        </w:rPr>
+      </w:pPr>
+      <w:r>
+        <w:rPr>
+          <w:rFonts w:ascii="Times New Roman" w:eastAsia="Times New Roman" w:hAnsi="Times New Roman" w:cs="Times New Roman"/>
+          <w:b/>
+          <w:bCs/>
+          <w:sz w:val="36"/>
+          <w:szCs w:val="36"/>
+        </w:rPr>
+        <w:t>Complexity Analysis</w:t>
+      </w:r>
+    </w:p>
+    <w:p>
+      <w:pPr>
+        <w:numPr>
+          <w:ilvl w:val="0"/>
+          <w:numId w:val="8"/>
+        </w:numPr>
+        <w:spacing w:before="100" w:beforeAutospacing="1" w:after="100" w:afterAutospacing="1" w:line="240" w:lineRule="auto"/>
+        <w:rPr>
+          <w:rFonts w:ascii="Times New Roman" w:eastAsia="Times New Roman" w:hAnsi="Times New Roman" w:cs="Times New Roman"/>
+          <w:sz w:val="24"/>
+          <w:szCs w:val="24"/>
+        </w:rPr>
+      </w:pPr>
+      <w:r>
+        <w:rPr>
+          <w:rFonts w:ascii="Times New Roman" w:eastAsia="Times New Roman" w:hAnsi="Times New Roman" w:cs="Times New Roman"/>
+          <w:b/>
+          <w:bCs/>
+          <w:sz w:val="24"/>
+          <w:szCs w:val="24"/>
+        </w:rPr>
+        <w:t>Time Complexity:</w:t>
+      </w:r>
+      <w:r>
+        <w:rPr>
+          <w:rFonts w:ascii="Times New Roman" w:eastAsia="Times New Roman" w:hAnsi="Times New Roman" w:cs="Times New Roman"/>
+          <w:sz w:val="24"/>
+          <w:szCs w:val="24"/>
+        </w:rPr>
+        <w:t xml:space="preserve"> $</w:t>
+      </w:r>
+      <w:proofErr w:type="gramStart"/>
+      <w:r>
+        <w:rPr>
+          <w:rFonts w:ascii="Times New Roman" w:eastAsia="Times New Roman" w:hAnsi="Times New Roman" w:cs="Times New Roman"/>
+          <w:sz w:val="24"/>
+          <w:szCs w:val="24"/>
+        </w:rPr>
+        <w:t>O(</w:t>
+      </w:r>
+      <w:proofErr w:type="gramEnd"/>
+      <w:r>
+        <w:rPr>
+          <w:rFonts w:ascii="Times New Roman" w:eastAsia="Times New Roman" w:hAnsi="Times New Roman" w:cs="Times New Roman"/>
+          <w:sz w:val="24"/>
+          <w:szCs w:val="24"/>
+        </w:rPr>
+        <w:t>V + E)$ — Just like BFS, we look at every single vertex ($V$) and every single edge ($E$) exactly once.</w:t>
+      </w:r>
+    </w:p>
+    <w:p>
+      <w:pPr>
+        <w:numPr>
+          <w:ilvl w:val="0"/>
+          <w:numId w:val="8"/>
+        </w:numPr>
+        <w:spacing w:before="100" w:beforeAutospacing="1" w:after="100" w:afterAutospacing="1" w:line="240" w:lineRule="auto"/>
+        <w:rPr>
+          <w:rFonts w:ascii="Times New Roman" w:eastAsia="Times New Roman" w:hAnsi="Times New Roman" w:cs="Times New Roman"/>
+          <w:sz w:val="24"/>
+          <w:szCs w:val="24"/>
+        </w:rPr>
+      </w:pPr>
+      <w:r>
+        <w:rPr>
+          <w:rFonts w:ascii="Times New Roman" w:eastAsia="Times New Roman" w:hAnsi="Times New Roman" w:cs="Times New Roman"/>
+          <w:b/>
+          <w:bCs/>
+          <w:sz w:val="24"/>
+          <w:szCs w:val="24"/>
+        </w:rPr>
+        <w:t>Space Complexity:</w:t>
+      </w:r>
+      <w:r>
+        <w:rPr>
+          <w:rFonts w:ascii="Times New Roman" w:eastAsia="Times New Roman" w:hAnsi="Times New Roman" w:cs="Times New Roman"/>
+          <w:sz w:val="24"/>
+          <w:szCs w:val="24"/>
+        </w:rPr>
+        <w:t xml:space="preserve"> $</w:t>
+      </w:r>
+      <w:proofErr w:type="gramStart"/>
+      <w:r>
+        <w:rPr>
+          <w:rFonts w:ascii="Times New Roman" w:eastAsia="Times New Roman" w:hAnsi="Times New Roman" w:cs="Times New Roman"/>
+          <w:sz w:val="24"/>
+          <w:szCs w:val="24"/>
+        </w:rPr>
+        <w:t>O(</w:t>
+      </w:r>
+      <w:proofErr w:type="gramEnd"/>
+      <w:r>
+        <w:rPr>
+          <w:rFonts w:ascii="Times New Roman" w:eastAsia="Times New Roman" w:hAnsi="Times New Roman" w:cs="Times New Roman"/>
+          <w:sz w:val="24"/>
+          <w:szCs w:val="24"/>
+        </w:rPr>
+        <w:t>V)$ — In the worst-case scenario (like a graph that is just one long straight line), the call stack or iterative stack will hold every single vertex in the graph at once.</w:t>
       </w:r>
     </w:p>
     <w:p>
@@ -2015,6 +3464,155 @@
     </w:lvl>
   </w:abstractNum>
   <w:abstractNum w:abstractNumId="1">
+    <w:nsid w:val="172D3F28"/>
+    <w:multiLevelType w:val="multilevel"/>
+    <w:tmpl w:val="5A1C6A20"/>
+    <w:lvl w:ilvl="0">
+      <w:start w:val="1"/>
+      <w:numFmt w:val="bullet"/>
+      <w:lvlText w:val=""/>
+      <w:lvlJc w:val="left"/>
+      <w:pPr>
+        <w:tabs>
+          <w:tab w:val="num" w:pos="720"/>
+        </w:tabs>
+        <w:ind w:left="720" w:hanging="360"/>
+      </w:pPr>
+      <w:rPr>
+        <w:rFonts w:ascii="Symbol" w:hAnsi="Symbol" w:hint="default"/>
+        <w:sz w:val="20"/>
+      </w:rPr>
+    </w:lvl>
+    <w:lvl w:ilvl="1" w:tentative="1">
+      <w:start w:val="1"/>
+      <w:numFmt w:val="bullet"/>
+      <w:lvlText w:val="o"/>
+      <w:lvlJc w:val="left"/>
+      <w:pPr>
+        <w:tabs>
+          <w:tab w:val="num" w:pos="1440"/>
+        </w:tabs>
+        <w:ind w:left="1440" w:hanging="360"/>
+      </w:pPr>
+      <w:rPr>
+        <w:rFonts w:ascii="Courier New" w:hAnsi="Courier New" w:hint="default"/>
+        <w:sz w:val="20"/>
+      </w:rPr>
+    </w:lvl>
+    <w:lvl w:ilvl="2" w:tentative="1">
+      <w:start w:val="1"/>
+      <w:numFmt w:val="bullet"/>
+      <w:lvlText w:val=""/>
+      <w:lvlJc w:val="left"/>
+      <w:pPr>
+        <w:tabs>
+          <w:tab w:val="num" w:pos="2160"/>
+        </w:tabs>
+        <w:ind w:left="2160" w:hanging="360"/>
+      </w:pPr>
+      <w:rPr>
+        <w:rFonts w:ascii="Wingdings" w:hAnsi="Wingdings" w:hint="default"/>
+        <w:sz w:val="20"/>
+      </w:rPr>
+    </w:lvl>
+    <w:lvl w:ilvl="3" w:tentative="1">
+      <w:start w:val="1"/>
+      <w:numFmt w:val="bullet"/>
+      <w:lvlText w:val=""/>
+      <w:lvlJc w:val="left"/>
+      <w:pPr>
+        <w:tabs>
+          <w:tab w:val="num" w:pos="2880"/>
+        </w:tabs>
+        <w:ind w:left="2880" w:hanging="360"/>
+      </w:pPr>
+      <w:rPr>
+        <w:rFonts w:ascii="Wingdings" w:hAnsi="Wingdings" w:hint="default"/>
+        <w:sz w:val="20"/>
+      </w:rPr>
+    </w:lvl>
+    <w:lvl w:ilvl="4" w:tentative="1">
+      <w:start w:val="1"/>
+      <w:numFmt w:val="bullet"/>
+      <w:lvlText w:val=""/>
+      <w:lvlJc w:val="left"/>
+      <w:pPr>
+        <w:tabs>
+          <w:tab w:val="num" w:pos="3600"/>
+        </w:tabs>
+        <w:ind w:left="3600" w:hanging="360"/>
+      </w:pPr>
+      <w:rPr>
+        <w:rFonts w:ascii="Wingdings" w:hAnsi="Wingdings" w:hint="default"/>
+        <w:sz w:val="20"/>
+      </w:rPr>
+    </w:lvl>
+    <w:lvl w:ilvl="5" w:tentative="1">
+      <w:start w:val="1"/>
+      <w:numFmt w:val="bullet"/>
+      <w:lvlText w:val=""/>
+      <w:lvlJc w:val="left"/>
+      <w:pPr>
+        <w:tabs>
+          <w:tab w:val="num" w:pos="4320"/>
+        </w:tabs>
+        <w:ind w:left="4320" w:hanging="360"/>
+      </w:pPr>
+      <w:rPr>
+        <w:rFonts w:ascii="Wingdings" w:hAnsi="Wingdings" w:hint="default"/>
+        <w:sz w:val="20"/>
+      </w:rPr>
+    </w:lvl>
+    <w:lvl w:ilvl="6" w:tentative="1">
+      <w:start w:val="1"/>
+      <w:numFmt w:val="bullet"/>
+      <w:lvlText w:val=""/>
+      <w:lvlJc w:val="left"/>
+      <w:pPr>
+        <w:tabs>
+          <w:tab w:val="num" w:pos="5040"/>
+        </w:tabs>
+        <w:ind w:left="5040" w:hanging="360"/>
+      </w:pPr>
+      <w:rPr>
+        <w:rFonts w:ascii="Wingdings" w:hAnsi="Wingdings" w:hint="default"/>
+        <w:sz w:val="20"/>
+      </w:rPr>
+    </w:lvl>
+    <w:lvl w:ilvl="7" w:tentative="1">
+      <w:start w:val="1"/>
+      <w:numFmt w:val="bullet"/>
+      <w:lvlText w:val=""/>
+      <w:lvlJc w:val="left"/>
+      <w:pPr>
+        <w:tabs>
+          <w:tab w:val="num" w:pos="5760"/>
+        </w:tabs>
+        <w:ind w:left="5760" w:hanging="360"/>
+      </w:pPr>
+      <w:rPr>
+        <w:rFonts w:ascii="Wingdings" w:hAnsi="Wingdings" w:hint="default"/>
+        <w:sz w:val="20"/>
+      </w:rPr>
+    </w:lvl>
+    <w:lvl w:ilvl="8" w:tentative="1">
+      <w:start w:val="1"/>
+      <w:numFmt w:val="bullet"/>
+      <w:lvlText w:val=""/>
+      <w:lvlJc w:val="left"/>
+      <w:pPr>
+        <w:tabs>
+          <w:tab w:val="num" w:pos="6480"/>
+        </w:tabs>
+        <w:ind w:left="6480" w:hanging="360"/>
+      </w:pPr>
+      <w:rPr>
+        <w:rFonts w:ascii="Wingdings" w:hAnsi="Wingdings" w:hint="default"/>
+        <w:sz w:val="20"/>
+      </w:rPr>
+    </w:lvl>
+  </w:abstractNum>
+  <w:abstractNum w:abstractNumId="2">
     <w:nsid w:val="1A810A57"/>
     <w:multiLevelType w:val="multilevel"/>
     <w:tmpl w:val="D5FCE300"/>
@@ -2163,7 +3761,7 @@
       </w:rPr>
     </w:lvl>
   </w:abstractNum>
-  <w:abstractNum w:abstractNumId="2">
+  <w:abstractNum w:abstractNumId="3">
     <w:nsid w:val="28F15804"/>
     <w:multiLevelType w:val="multilevel"/>
     <w:tmpl w:val="F07093E4"/>
@@ -2276,7 +3874,156 @@
       </w:pPr>
     </w:lvl>
   </w:abstractNum>
-  <w:abstractNum w:abstractNumId="3">
+  <w:abstractNum w:abstractNumId="4">
+    <w:nsid w:val="325B1795"/>
+    <w:multiLevelType w:val="multilevel"/>
+    <w:tmpl w:val="CE6A5AD6"/>
+    <w:lvl w:ilvl="0">
+      <w:start w:val="1"/>
+      <w:numFmt w:val="bullet"/>
+      <w:lvlText w:val=""/>
+      <w:lvlJc w:val="left"/>
+      <w:pPr>
+        <w:tabs>
+          <w:tab w:val="num" w:pos="720"/>
+        </w:tabs>
+        <w:ind w:left="720" w:hanging="360"/>
+      </w:pPr>
+      <w:rPr>
+        <w:rFonts w:ascii="Symbol" w:hAnsi="Symbol" w:hint="default"/>
+        <w:sz w:val="20"/>
+      </w:rPr>
+    </w:lvl>
+    <w:lvl w:ilvl="1" w:tentative="1">
+      <w:start w:val="1"/>
+      <w:numFmt w:val="bullet"/>
+      <w:lvlText w:val="o"/>
+      <w:lvlJc w:val="left"/>
+      <w:pPr>
+        <w:tabs>
+          <w:tab w:val="num" w:pos="1440"/>
+        </w:tabs>
+        <w:ind w:left="1440" w:hanging="360"/>
+      </w:pPr>
+      <w:rPr>
+        <w:rFonts w:ascii="Courier New" w:hAnsi="Courier New" w:hint="default"/>
+        <w:sz w:val="20"/>
+      </w:rPr>
+    </w:lvl>
+    <w:lvl w:ilvl="2" w:tentative="1">
+      <w:start w:val="1"/>
+      <w:numFmt w:val="bullet"/>
+      <w:lvlText w:val=""/>
+      <w:lvlJc w:val="left"/>
+      <w:pPr>
+        <w:tabs>
+          <w:tab w:val="num" w:pos="2160"/>
+        </w:tabs>
+        <w:ind w:left="2160" w:hanging="360"/>
+      </w:pPr>
+      <w:rPr>
+        <w:rFonts w:ascii="Wingdings" w:hAnsi="Wingdings" w:hint="default"/>
+        <w:sz w:val="20"/>
+      </w:rPr>
+    </w:lvl>
+    <w:lvl w:ilvl="3" w:tentative="1">
+      <w:start w:val="1"/>
+      <w:numFmt w:val="bullet"/>
+      <w:lvlText w:val=""/>
+      <w:lvlJc w:val="left"/>
+      <w:pPr>
+        <w:tabs>
+          <w:tab w:val="num" w:pos="2880"/>
+        </w:tabs>
+        <w:ind w:left="2880" w:hanging="360"/>
+      </w:pPr>
+      <w:rPr>
+        <w:rFonts w:ascii="Wingdings" w:hAnsi="Wingdings" w:hint="default"/>
+        <w:sz w:val="20"/>
+      </w:rPr>
+    </w:lvl>
+    <w:lvl w:ilvl="4" w:tentative="1">
+      <w:start w:val="1"/>
+      <w:numFmt w:val="bullet"/>
+      <w:lvlText w:val=""/>
+      <w:lvlJc w:val="left"/>
+      <w:pPr>
+        <w:tabs>
+          <w:tab w:val="num" w:pos="3600"/>
+        </w:tabs>
+        <w:ind w:left="3600" w:hanging="360"/>
+      </w:pPr>
+      <w:rPr>
+        <w:rFonts w:ascii="Wingdings" w:hAnsi="Wingdings" w:hint="default"/>
+        <w:sz w:val="20"/>
+      </w:rPr>
+    </w:lvl>
+    <w:lvl w:ilvl="5" w:tentative="1">
+      <w:start w:val="1"/>
+      <w:numFmt w:val="bullet"/>
+      <w:lvlText w:val=""/>
+      <w:lvlJc w:val="left"/>
+      <w:pPr>
+        <w:tabs>
+          <w:tab w:val="num" w:pos="4320"/>
+        </w:tabs>
+        <w:ind w:left="4320" w:hanging="360"/>
+      </w:pPr>
+      <w:rPr>
+        <w:rFonts w:ascii="Wingdings" w:hAnsi="Wingdings" w:hint="default"/>
+        <w:sz w:val="20"/>
+      </w:rPr>
+    </w:lvl>
+    <w:lvl w:ilvl="6" w:tentative="1">
+      <w:start w:val="1"/>
+      <w:numFmt w:val="bullet"/>
+      <w:lvlText w:val=""/>
+      <w:lvlJc w:val="left"/>
+      <w:pPr>
+        <w:tabs>
+          <w:tab w:val="num" w:pos="5040"/>
+        </w:tabs>
+        <w:ind w:left="5040" w:hanging="360"/>
+      </w:pPr>
+      <w:rPr>
+        <w:rFonts w:ascii="Wingdings" w:hAnsi="Wingdings" w:hint="default"/>
+        <w:sz w:val="20"/>
+      </w:rPr>
+    </w:lvl>
+    <w:lvl w:ilvl="7" w:tentative="1">
+      <w:start w:val="1"/>
+      <w:numFmt w:val="bullet"/>
+      <w:lvlText w:val=""/>
+      <w:lvlJc w:val="left"/>
+      <w:pPr>
+        <w:tabs>
+          <w:tab w:val="num" w:pos="5760"/>
+        </w:tabs>
+        <w:ind w:left="5760" w:hanging="360"/>
+      </w:pPr>
+      <w:rPr>
+        <w:rFonts w:ascii="Wingdings" w:hAnsi="Wingdings" w:hint="default"/>
+        <w:sz w:val="20"/>
+      </w:rPr>
+    </w:lvl>
+    <w:lvl w:ilvl="8" w:tentative="1">
+      <w:start w:val="1"/>
+      <w:numFmt w:val="bullet"/>
+      <w:lvlText w:val=""/>
+      <w:lvlJc w:val="left"/>
+      <w:pPr>
+        <w:tabs>
+          <w:tab w:val="num" w:pos="6480"/>
+        </w:tabs>
+        <w:ind w:left="6480" w:hanging="360"/>
+      </w:pPr>
+      <w:rPr>
+        <w:rFonts w:ascii="Wingdings" w:hAnsi="Wingdings" w:hint="default"/>
+        <w:sz w:val="20"/>
+      </w:rPr>
+    </w:lvl>
+  </w:abstractNum>
+  <w:abstractNum w:abstractNumId="5">
     <w:nsid w:val="37DF2B4C"/>
     <w:multiLevelType w:val="multilevel"/>
     <w:tmpl w:val="74A42638"/>
@@ -2425,17 +4172,255 @@
       </w:rPr>
     </w:lvl>
   </w:abstractNum>
+  <w:abstractNum w:abstractNumId="6">
+    <w:nsid w:val="578F49EB"/>
+    <w:multiLevelType w:val="multilevel"/>
+    <w:tmpl w:val="0386AC4C"/>
+    <w:lvl w:ilvl="0">
+      <w:start w:val="1"/>
+      <w:numFmt w:val="decimal"/>
+      <w:lvlText w:val="%1."/>
+      <w:lvlJc w:val="left"/>
+      <w:pPr>
+        <w:tabs>
+          <w:tab w:val="num" w:pos="720"/>
+        </w:tabs>
+        <w:ind w:left="720" w:hanging="360"/>
+      </w:pPr>
+    </w:lvl>
+    <w:lvl w:ilvl="1" w:tentative="1">
+      <w:start w:val="1"/>
+      <w:numFmt w:val="decimal"/>
+      <w:lvlText w:val="%2."/>
+      <w:lvlJc w:val="left"/>
+      <w:pPr>
+        <w:tabs>
+          <w:tab w:val="num" w:pos="1440"/>
+        </w:tabs>
+        <w:ind w:left="1440" w:hanging="360"/>
+      </w:pPr>
+    </w:lvl>
+    <w:lvl w:ilvl="2" w:tentative="1">
+      <w:start w:val="1"/>
+      <w:numFmt w:val="decimal"/>
+      <w:lvlText w:val="%3."/>
+      <w:lvlJc w:val="left"/>
+      <w:pPr>
+        <w:tabs>
+          <w:tab w:val="num" w:pos="2160"/>
+        </w:tabs>
+        <w:ind w:left="2160" w:hanging="360"/>
+      </w:pPr>
+    </w:lvl>
+    <w:lvl w:ilvl="3" w:tentative="1">
+      <w:start w:val="1"/>
+      <w:numFmt w:val="decimal"/>
+      <w:lvlText w:val="%4."/>
+      <w:lvlJc w:val="left"/>
+      <w:pPr>
+        <w:tabs>
+          <w:tab w:val="num" w:pos="2880"/>
+        </w:tabs>
+        <w:ind w:left="2880" w:hanging="360"/>
+      </w:pPr>
+    </w:lvl>
+    <w:lvl w:ilvl="4" w:tentative="1">
+      <w:start w:val="1"/>
+      <w:numFmt w:val="decimal"/>
+      <w:lvlText w:val="%5."/>
+      <w:lvlJc w:val="left"/>
+      <w:pPr>
+        <w:tabs>
+          <w:tab w:val="num" w:pos="3600"/>
+        </w:tabs>
+        <w:ind w:left="3600" w:hanging="360"/>
+      </w:pPr>
+    </w:lvl>
+    <w:lvl w:ilvl="5" w:tentative="1">
+      <w:start w:val="1"/>
+      <w:numFmt w:val="decimal"/>
+      <w:lvlText w:val="%6."/>
+      <w:lvlJc w:val="left"/>
+      <w:pPr>
+        <w:tabs>
+          <w:tab w:val="num" w:pos="4320"/>
+        </w:tabs>
+        <w:ind w:left="4320" w:hanging="360"/>
+      </w:pPr>
+    </w:lvl>
+    <w:lvl w:ilvl="6" w:tentative="1">
+      <w:start w:val="1"/>
+      <w:numFmt w:val="decimal"/>
+      <w:lvlText w:val="%7."/>
+      <w:lvlJc w:val="left"/>
+      <w:pPr>
+        <w:tabs>
+          <w:tab w:val="num" w:pos="5040"/>
+        </w:tabs>
+        <w:ind w:left="5040" w:hanging="360"/>
+      </w:pPr>
+    </w:lvl>
+    <w:lvl w:ilvl="7" w:tentative="1">
+      <w:start w:val="1"/>
+      <w:numFmt w:val="decimal"/>
+      <w:lvlText w:val="%8."/>
+      <w:lvlJc w:val="left"/>
+      <w:pPr>
+        <w:tabs>
+          <w:tab w:val="num" w:pos="5760"/>
+        </w:tabs>
+        <w:ind w:left="5760" w:hanging="360"/>
+      </w:pPr>
+    </w:lvl>
+    <w:lvl w:ilvl="8" w:tentative="1">
+      <w:start w:val="1"/>
+      <w:numFmt w:val="decimal"/>
+      <w:lvlText w:val="%9."/>
+      <w:lvlJc w:val="left"/>
+      <w:pPr>
+        <w:tabs>
+          <w:tab w:val="num" w:pos="6480"/>
+        </w:tabs>
+        <w:ind w:left="6480" w:hanging="360"/>
+      </w:pPr>
+    </w:lvl>
+  </w:abstractNum>
+  <w:abstractNum w:abstractNumId="7">
+    <w:nsid w:val="5A9727BE"/>
+    <w:multiLevelType w:val="multilevel"/>
+    <w:tmpl w:val="AA7842A6"/>
+    <w:lvl w:ilvl="0">
+      <w:start w:val="1"/>
+      <w:numFmt w:val="decimal"/>
+      <w:lvlText w:val="%1."/>
+      <w:lvlJc w:val="left"/>
+      <w:pPr>
+        <w:tabs>
+          <w:tab w:val="num" w:pos="720"/>
+        </w:tabs>
+        <w:ind w:left="720" w:hanging="360"/>
+      </w:pPr>
+    </w:lvl>
+    <w:lvl w:ilvl="1" w:tentative="1">
+      <w:start w:val="1"/>
+      <w:numFmt w:val="decimal"/>
+      <w:lvlText w:val="%2."/>
+      <w:lvlJc w:val="left"/>
+      <w:pPr>
+        <w:tabs>
+          <w:tab w:val="num" w:pos="1440"/>
+        </w:tabs>
+        <w:ind w:left="1440" w:hanging="360"/>
+      </w:pPr>
+    </w:lvl>
+    <w:lvl w:ilvl="2" w:tentative="1">
+      <w:start w:val="1"/>
+      <w:numFmt w:val="decimal"/>
+      <w:lvlText w:val="%3."/>
+      <w:lvlJc w:val="left"/>
+      <w:pPr>
+        <w:tabs>
+          <w:tab w:val="num" w:pos="2160"/>
+        </w:tabs>
+        <w:ind w:left="2160" w:hanging="360"/>
+      </w:pPr>
+    </w:lvl>
+    <w:lvl w:ilvl="3" w:tentative="1">
+      <w:start w:val="1"/>
+      <w:numFmt w:val="decimal"/>
+      <w:lvlText w:val="%4."/>
+      <w:lvlJc w:val="left"/>
+      <w:pPr>
+        <w:tabs>
+          <w:tab w:val="num" w:pos="2880"/>
+        </w:tabs>
+        <w:ind w:left="2880" w:hanging="360"/>
+      </w:pPr>
+    </w:lvl>
+    <w:lvl w:ilvl="4" w:tentative="1">
+      <w:start w:val="1"/>
+      <w:numFmt w:val="decimal"/>
+      <w:lvlText w:val="%5."/>
+      <w:lvlJc w:val="left"/>
+      <w:pPr>
+        <w:tabs>
+          <w:tab w:val="num" w:pos="3600"/>
+        </w:tabs>
+        <w:ind w:left="3600" w:hanging="360"/>
+      </w:pPr>
+    </w:lvl>
+    <w:lvl w:ilvl="5" w:tentative="1">
+      <w:start w:val="1"/>
+      <w:numFmt w:val="decimal"/>
+      <w:lvlText w:val="%6."/>
+      <w:lvlJc w:val="left"/>
+      <w:pPr>
+        <w:tabs>
+          <w:tab w:val="num" w:pos="4320"/>
+        </w:tabs>
+        <w:ind w:left="4320" w:hanging="360"/>
+      </w:pPr>
+    </w:lvl>
+    <w:lvl w:ilvl="6" w:tentative="1">
+      <w:start w:val="1"/>
+      <w:numFmt w:val="decimal"/>
+      <w:lvlText w:val="%7."/>
+      <w:lvlJc w:val="left"/>
+      <w:pPr>
+        <w:tabs>
+          <w:tab w:val="num" w:pos="5040"/>
+        </w:tabs>
+        <w:ind w:left="5040" w:hanging="360"/>
+      </w:pPr>
+    </w:lvl>
+    <w:lvl w:ilvl="7" w:tentative="1">
+      <w:start w:val="1"/>
+      <w:numFmt w:val="decimal"/>
+      <w:lvlText w:val="%8."/>
+      <w:lvlJc w:val="left"/>
+      <w:pPr>
+        <w:tabs>
+          <w:tab w:val="num" w:pos="5760"/>
+        </w:tabs>
+        <w:ind w:left="5760" w:hanging="360"/>
+      </w:pPr>
+    </w:lvl>
+    <w:lvl w:ilvl="8" w:tentative="1">
+      <w:start w:val="1"/>
+      <w:numFmt w:val="decimal"/>
+      <w:lvlText w:val="%9."/>
+      <w:lvlJc w:val="left"/>
+      <w:pPr>
+        <w:tabs>
+          <w:tab w:val="num" w:pos="6480"/>
+        </w:tabs>
+        <w:ind w:left="6480" w:hanging="360"/>
+      </w:pPr>
+    </w:lvl>
+  </w:abstractNum>
   <w:num w:numId="1">
-    <w:abstractNumId w:val="2"/>
+    <w:abstractNumId w:val="3"/>
   </w:num>
   <w:num w:numId="2">
-    <w:abstractNumId w:val="1"/>
+    <w:abstractNumId w:val="2"/>
   </w:num>
   <w:num w:numId="3">
     <w:abstractNumId w:val="0"/>
   </w:num>
   <w:num w:numId="4">
-    <w:abstractNumId w:val="3"/>
+    <w:abstractNumId w:val="5"/>
+  </w:num>
+  <w:num w:numId="5">
+    <w:abstractNumId w:val="7"/>
+  </w:num>
+  <w:num w:numId="6">
+    <w:abstractNumId w:val="1"/>
+  </w:num>
+  <w:num w:numId="7">
+    <w:abstractNumId w:val="6"/>
+  </w:num>
+  <w:num w:numId="8">
+    <w:abstractNumId w:val="4"/>
   </w:num>
 </w:numbering>
 </file>
@@ -2599,6 +4584,7 @@
   <w:style w:type="paragraph" w:default="1" w:styleId="Normal">
     <w:name w:val="Normal"/>
     <w:qFormat/>
+    <w:rsid w:val="00776A4B"/>
   </w:style>
   <w:style w:type="paragraph" w:styleId="Heading2">
     <w:name w:val="heading 2"/>

</xml_diff>